<commit_message>
Atualiza documentação em docs/
</commit_message>
<xml_diff>
--- a/docs/Projeto_Integrador_SEGUNDA_ETAPA.docx
+++ b/docs/Projeto_Integrador_SEGUNDA_ETAPA.docx
@@ -181,6 +181,10 @@
     </w:p>
     <w:p/>
     <w:p/>
+    <w:p/>
+    <w:p/>
+    <w:p/>
+    <w:p/>
     <w:p>
       <w:pPr>
         <w:spacing w:line="240" w:lineRule="auto"/>
@@ -199,19 +203,59 @@
         <w:br w:type="page"/>
       </w:r>
     </w:p>
-    <w:p/>
-    <w:p/>
     <w:p>
       <w:pPr>
         <w:spacing w:line="240" w:lineRule="auto"/>
         <w:ind w:firstLine="0"/>
         <w:jc w:val="center"/>
-      </w:pPr>
-      <w:r>
         <w:rPr>
           <w:b/>
         </w:rPr>
-        <w:t>Integrantes do grupo:</w:t>
+      </w:pPr>
+    </w:p>
+    <w:p>
+      <w:pPr>
+        <w:spacing w:line="240" w:lineRule="auto"/>
+        <w:ind w:firstLine="0"/>
+        <w:jc w:val="center"/>
+        <w:rPr>
+          <w:b/>
+        </w:rPr>
+      </w:pPr>
+    </w:p>
+    <w:p>
+      <w:pPr>
+        <w:spacing w:line="240" w:lineRule="auto"/>
+        <w:ind w:firstLine="0"/>
+        <w:jc w:val="center"/>
+      </w:pPr>
+      <w:proofErr w:type="spellStart"/>
+      <w:r>
+        <w:rPr>
+          <w:b/>
+        </w:rPr>
+        <w:t>Integrantes</w:t>
+      </w:r>
+      <w:proofErr w:type="spellEnd"/>
+      <w:r>
+        <w:rPr>
+          <w:b/>
+        </w:rPr>
+        <w:t xml:space="preserve"> do </w:t>
+      </w:r>
+      <w:proofErr w:type="spellStart"/>
+      <w:r>
+        <w:rPr>
+          <w:b/>
+        </w:rPr>
+        <w:t>grupo</w:t>
+      </w:r>
+      <w:proofErr w:type="spellEnd"/>
+      <w:r>
+        <w:rPr>
+          <w:b/>
+        </w:rPr>
+        <w:t>:</w:t>
       </w:r>
     </w:p>
     <w:p>
@@ -320,6 +364,14 @@
     <w:p/>
     <w:p/>
     <w:p/>
+    <w:p/>
+    <w:p/>
+    <w:p/>
+    <w:p/>
+    <w:p/>
+    <w:p/>
+    <w:p/>
+    <w:p/>
     <w:p>
       <w:pPr>
         <w:spacing w:line="240" w:lineRule="auto"/>
@@ -531,9 +583,59 @@
     </w:p>
     <w:p>
       <w:r>
-        <w:t>A segunda etapa busca concretizar a proposta por meio de uma prova de conceito funcional. Conforme a orientação da atividade, o desenvolvimento contempla a revisita justificada do projeto, a seleção das tecnologias de frontend, backend e banco de dados, a implementação do sistema, a organização do repositório no GitHub e a preparação de um vídeo curto demonstrando o resultado.</w:t>
+        <w:t xml:space="preserve">A segunda etapa busca concretizar a proposta por meio de uma prova de conceito funcional. Conforme a orientação da atividade, o desenvolvimento contempla a revisita justificada do projeto, a seleção das tecnologias de frontend, backend e banco de dados, </w:t>
+      </w:r>
+      <w:proofErr w:type="gramStart"/>
+      <w:r>
+        <w:t>a</w:t>
+      </w:r>
+      <w:proofErr w:type="gramEnd"/>
+      <w:r>
+        <w:t xml:space="preserve"> implementação do sistema, </w:t>
+      </w:r>
+      <w:proofErr w:type="gramStart"/>
+      <w:r>
+        <w:t>a</w:t>
+      </w:r>
+      <w:proofErr w:type="gramEnd"/>
+      <w:r>
+        <w:t xml:space="preserve"> organização do repositório no GitHub e a preparação de um </w:t>
+      </w:r>
+      <w:proofErr w:type="spellStart"/>
+      <w:r>
+        <w:t>vídeo</w:t>
+      </w:r>
+      <w:proofErr w:type="spellEnd"/>
+      <w:r>
+        <w:t xml:space="preserve"> </w:t>
+      </w:r>
+      <w:proofErr w:type="spellStart"/>
+      <w:r>
+        <w:t>curto</w:t>
+      </w:r>
+      <w:proofErr w:type="spellEnd"/>
+      <w:r>
+        <w:t xml:space="preserve"> </w:t>
+      </w:r>
+      <w:proofErr w:type="spellStart"/>
+      <w:r>
+        <w:t>demonstrando</w:t>
+      </w:r>
+      <w:proofErr w:type="spellEnd"/>
+      <w:r>
+        <w:t xml:space="preserve"> o </w:t>
+      </w:r>
+      <w:proofErr w:type="spellStart"/>
+      <w:r>
+        <w:t>resultado</w:t>
+      </w:r>
+      <w:proofErr w:type="spellEnd"/>
+      <w:r>
+        <w:t>.</w:t>
       </w:r>
     </w:p>
+    <w:p/>
+    <w:p/>
     <w:p>
       <w:pPr>
         <w:pStyle w:val="Ttulo1"/>
@@ -552,15 +654,52 @@
     </w:p>
     <w:p>
       <w:r>
-        <w:t>Por esse motivo, a segunda etapa prioriza o fluxo que representa o núcleo do AgendaSaúde: o paciente acessar o sistema, identificar um profissional ou especialidade, visualizar horários realmente disponíveis, confirmar o agendamento e posteriormente acompanhar, cancelar ou reagendar a consulta. Essa decisão mantém aderência à persona e à jornada descritas na primeira etapa e permite validar o comportamento principal do sistema.</w:t>
+        <w:t xml:space="preserve">Por esse motivo, a segunda etapa prioriza o fluxo que representa o núcleo do AgendaSaúde: o paciente acessar o sistema, identificar um profissional ou especialidade, visualizar horários realmente disponíveis, confirmar o agendamento e posteriormente acompanhar, cancelar ou reagendar a consulta. Essa decisão mantém aderência à persona e </w:t>
+      </w:r>
+      <w:r>
+        <w:lastRenderedPageBreak/>
+        <w:t>à jornada descritas na primeira etapa e permite validar o comportamento principal do sistema.</w:t>
       </w:r>
     </w:p>
     <w:p>
       <w:r>
-        <w:lastRenderedPageBreak/>
-        <w:t>A revisita também resultou em uma melhoria de escopo: em vez de apenas exibir telas estáticas, a prova de conceito utiliza persistência de dados, autenticação básica, regras de disponibilidade e prevenção de conflito de horários. Dessa forma, a jornada deixa de ser apenas ilustrativa e passa a representar um processo executável de ponta a ponta.</w:t>
+        <w:t xml:space="preserve">A revisita também resultou em uma melhoria de escopo: em vez de apenas exibir telas estáticas, a prova de conceito utiliza persistência de dados, autenticação básica, regras de disponibilidade e prevenção de conflito de horários. Dessa forma, a jornada deixa de ser apenas ilustrativa e passa a representar um </w:t>
+      </w:r>
+      <w:proofErr w:type="spellStart"/>
+      <w:r>
+        <w:t>processo</w:t>
+      </w:r>
+      <w:proofErr w:type="spellEnd"/>
+      <w:r>
+        <w:t xml:space="preserve"> </w:t>
+      </w:r>
+      <w:proofErr w:type="spellStart"/>
+      <w:r>
+        <w:t>executável</w:t>
+      </w:r>
+      <w:proofErr w:type="spellEnd"/>
+      <w:r>
+        <w:t xml:space="preserve"> de </w:t>
+      </w:r>
+      <w:proofErr w:type="spellStart"/>
+      <w:r>
+        <w:t>ponta</w:t>
+      </w:r>
+      <w:proofErr w:type="spellEnd"/>
+      <w:r>
+        <w:t xml:space="preserve"> a </w:t>
+      </w:r>
+      <w:proofErr w:type="spellStart"/>
+      <w:r>
+        <w:t>ponta</w:t>
+      </w:r>
+      <w:proofErr w:type="spellEnd"/>
+      <w:r>
+        <w:t>.</w:t>
       </w:r>
     </w:p>
+    <w:p/>
+    <w:p/>
     <w:p>
       <w:pPr>
         <w:pStyle w:val="Ttulo1"/>
@@ -574,9 +713,42 @@
     </w:p>
     <w:p>
       <w:r>
-        <w:t>A prova de conceito escolhida foi denominada “Jornada de Agendamento do Paciente”. Seu objetivo é demonstrar que o AgendaSaúde consegue atender as etapas mais relevantes da jornada de Maria Aparecida Santos, oferecendo uma experiência simples e controlada.</w:t>
+        <w:t xml:space="preserve">A prova de conceito escolhida foi denominada “Jornada de Agendamento do Paciente”. Seu objetivo é demonstrar que o AgendaSaúde consegue atender as etapas mais relevantes da jornada de Maria Aparecida Santos, </w:t>
+      </w:r>
+      <w:proofErr w:type="spellStart"/>
+      <w:r>
+        <w:t>oferecendo</w:t>
+      </w:r>
+      <w:proofErr w:type="spellEnd"/>
+      <w:r>
+        <w:t xml:space="preserve"> </w:t>
+      </w:r>
+      <w:proofErr w:type="spellStart"/>
+      <w:r>
+        <w:t>uma</w:t>
+      </w:r>
+      <w:proofErr w:type="spellEnd"/>
+      <w:r>
+        <w:t xml:space="preserve"> </w:t>
+      </w:r>
+      <w:proofErr w:type="spellStart"/>
+      <w:r>
+        <w:t>experiência</w:t>
+      </w:r>
+      <w:proofErr w:type="spellEnd"/>
+      <w:r>
+        <w:t xml:space="preserve"> simples e </w:t>
+      </w:r>
+      <w:proofErr w:type="spellStart"/>
+      <w:r>
+        <w:t>controlada</w:t>
+      </w:r>
+      <w:proofErr w:type="spellEnd"/>
+      <w:r>
+        <w:t>.</w:t>
       </w:r>
     </w:p>
+    <w:p/>
     <w:p>
       <w:pPr>
         <w:pStyle w:val="Ttulo2"/>
@@ -675,8 +847,42 @@
         <w:ind w:left="709" w:hanging="283"/>
       </w:pPr>
       <w:r>
-        <w:t>Mensagens de retorno ao usuário e indicadores simples da agenda.</w:t>
-      </w:r>
+        <w:t xml:space="preserve">Mensagens de retorno </w:t>
+      </w:r>
+      <w:proofErr w:type="spellStart"/>
+      <w:r>
+        <w:t>ao</w:t>
+      </w:r>
+      <w:proofErr w:type="spellEnd"/>
+      <w:r>
+        <w:t xml:space="preserve"> </w:t>
+      </w:r>
+      <w:proofErr w:type="spellStart"/>
+      <w:r>
+        <w:t>usuário</w:t>
+      </w:r>
+      <w:proofErr w:type="spellEnd"/>
+      <w:r>
+        <w:t xml:space="preserve"> e </w:t>
+      </w:r>
+      <w:proofErr w:type="spellStart"/>
+      <w:r>
+        <w:t>indicadores</w:t>
+      </w:r>
+      <w:proofErr w:type="spellEnd"/>
+      <w:r>
+        <w:t xml:space="preserve"> simples da agenda.</w:t>
+      </w:r>
+    </w:p>
+    <w:p>
+      <w:pPr>
+        <w:pStyle w:val="Commarcadores"/>
+        <w:numPr>
+          <w:ilvl w:val="0"/>
+          <w:numId w:val="0"/>
+        </w:numPr>
+        <w:ind w:left="709"/>
+      </w:pPr>
     </w:p>
     <w:p>
       <w:pPr>
@@ -691,9 +897,39 @@
     </w:p>
     <w:p>
       <w:r>
-        <w:t>Por se tratar de uma prova de conceito acadêmica, não foram implementados integrações com sistemas governamentais, prontuário eletrônico, envio real de SMS ou e-mail, pagamento, assinatura digital, telemedicina ou regras específicas de uma unidade de saúde. Tais itens podem compor evoluções futuras do produto, mas não são necessários para demonstrar a viabilidade do fluxo principal selecionado.</w:t>
+        <w:t>Por se tratar de uma prova de conceito acadêmica, não foram implementados integrações com sistemas governamentais, prontuário eletrônico, envio real de SMS ou e-</w:t>
+      </w:r>
+      <w:r>
+        <w:lastRenderedPageBreak/>
+        <w:t xml:space="preserve">mail, pagamento, assinatura digital, telemedicina ou regras específicas de uma unidade de saúde. Tais itens podem compor evoluções futuras do produto, mas não são necessários para demonstrar a </w:t>
+      </w:r>
+      <w:proofErr w:type="spellStart"/>
+      <w:r>
+        <w:t>viabilidade</w:t>
+      </w:r>
+      <w:proofErr w:type="spellEnd"/>
+      <w:r>
+        <w:t xml:space="preserve"> do </w:t>
+      </w:r>
+      <w:proofErr w:type="spellStart"/>
+      <w:r>
+        <w:t>fluxo</w:t>
+      </w:r>
+      <w:proofErr w:type="spellEnd"/>
+      <w:r>
+        <w:t xml:space="preserve"> principal </w:t>
+      </w:r>
+      <w:proofErr w:type="spellStart"/>
+      <w:r>
+        <w:t>selecionado</w:t>
+      </w:r>
+      <w:proofErr w:type="spellEnd"/>
+      <w:r>
+        <w:t>.</w:t>
       </w:r>
     </w:p>
+    <w:p/>
+    <w:p/>
     <w:p>
       <w:pPr>
         <w:pStyle w:val="Ttulo1"/>
@@ -707,11 +943,7 @@
     </w:p>
     <w:p>
       <w:r>
-        <w:t xml:space="preserve">A escolha tecnológica priorizou simplicidade, gratuidade, portabilidade e facilidade de reprodução pelos integrantes e pelo avaliador. O projeto pode ser executado com Python </w:t>
-      </w:r>
-      <w:r>
-        <w:lastRenderedPageBreak/>
-        <w:t>3.10 ou superior e um navegador moderno, sem necessidade de instalar frameworks adicionais.</w:t>
+        <w:t>A escolha tecnológica priorizou simplicidade, gratuidade, portabilidade e facilidade de reprodução pelos integrantes e pelo avaliador. O projeto pode ser executado com Python 3.10 ou superior e um navegador moderno, sem necessidade de instalar frameworks adicionais.</w:t>
       </w:r>
     </w:p>
     <w:tbl>
@@ -1059,13 +1291,61 @@
         <w:spacing w:line="240" w:lineRule="auto"/>
         <w:ind w:firstLine="0"/>
         <w:jc w:val="center"/>
-      </w:pPr>
-      <w:r>
         <w:rPr>
           <w:i/>
         </w:rPr>
-        <w:t>Fonte: Elaboração autoral.</w:t>
-      </w:r>
+      </w:pPr>
+      <w:r>
+        <w:rPr>
+          <w:i/>
+        </w:rPr>
+        <w:t xml:space="preserve">Fonte: </w:t>
+      </w:r>
+      <w:proofErr w:type="spellStart"/>
+      <w:r>
+        <w:rPr>
+          <w:i/>
+        </w:rPr>
+        <w:t>Elaboração</w:t>
+      </w:r>
+      <w:proofErr w:type="spellEnd"/>
+      <w:r>
+        <w:rPr>
+          <w:i/>
+        </w:rPr>
+        <w:t xml:space="preserve"> </w:t>
+      </w:r>
+      <w:proofErr w:type="spellStart"/>
+      <w:r>
+        <w:rPr>
+          <w:i/>
+        </w:rPr>
+        <w:t>autoral</w:t>
+      </w:r>
+      <w:proofErr w:type="spellEnd"/>
+      <w:r>
+        <w:rPr>
+          <w:i/>
+        </w:rPr>
+        <w:t>.</w:t>
+      </w:r>
+    </w:p>
+    <w:p>
+      <w:pPr>
+        <w:spacing w:line="240" w:lineRule="auto"/>
+        <w:ind w:firstLine="0"/>
+        <w:jc w:val="center"/>
+        <w:rPr>
+          <w:i/>
+        </w:rPr>
+      </w:pPr>
+    </w:p>
+    <w:p>
+      <w:pPr>
+        <w:spacing w:line="240" w:lineRule="auto"/>
+        <w:ind w:firstLine="0"/>
+        <w:jc w:val="center"/>
+      </w:pPr>
     </w:p>
     <w:p>
       <w:pPr>
@@ -1080,7 +1360,11 @@
     </w:p>
     <w:p>
       <w:r>
-        <w:t>O frontend foi construído como uma aplicação responsiva com duas áreas principais. A primeira contém as opções de login e criação de conta. Para facilitar a demonstração, o projeto inclui um usuário fictício de acesso, correspondente à persona Maria Aparecida Santos. Após a autenticação, o usuário acessa o painel de agendamento e seu histórico de consultas.</w:t>
+        <w:t xml:space="preserve">O frontend foi construído como uma aplicação responsiva com duas áreas principais. A primeira contém as opções de login e criação de conta. Para facilitar a demonstração, o projeto inclui um usuário fictício de acesso, correspondente à persona </w:t>
+      </w:r>
+      <w:r>
+        <w:lastRenderedPageBreak/>
+        <w:t>Maria Aparecida Santos. Após a autenticação, o usuário acessa o painel de agendamento e seu histórico de consultas.</w:t>
       </w:r>
     </w:p>
     <w:p>
@@ -1094,11 +1378,65 @@
       </w:r>
     </w:p>
     <w:p>
-      <w:r>
-        <w:lastRenderedPageBreak/>
-        <w:t>A interface foi organizada para funcionar em computadores e dispositivos móveis, mantendo a proposta da primeira etapa de oferecer acesso por diferentes tipos de equipamentos.</w:t>
+      <w:proofErr w:type="gramStart"/>
+      <w:r>
+        <w:t>A</w:t>
+      </w:r>
+      <w:proofErr w:type="gramEnd"/>
+      <w:r>
+        <w:t xml:space="preserve"> interface foi organizada para funcionar em computadores e dispositivos móveis, mantendo a proposta da primeira etapa de </w:t>
+      </w:r>
+      <w:proofErr w:type="spellStart"/>
+      <w:r>
+        <w:t>oferecer</w:t>
+      </w:r>
+      <w:proofErr w:type="spellEnd"/>
+      <w:r>
+        <w:t xml:space="preserve"> </w:t>
+      </w:r>
+      <w:proofErr w:type="spellStart"/>
+      <w:r>
+        <w:t>acesso</w:t>
+      </w:r>
+      <w:proofErr w:type="spellEnd"/>
+      <w:r>
+        <w:t xml:space="preserve"> </w:t>
+      </w:r>
+      <w:proofErr w:type="spellStart"/>
+      <w:r>
+        <w:t>por</w:t>
+      </w:r>
+      <w:proofErr w:type="spellEnd"/>
+      <w:r>
+        <w:t xml:space="preserve"> </w:t>
+      </w:r>
+      <w:proofErr w:type="spellStart"/>
+      <w:r>
+        <w:t>diferentes</w:t>
+      </w:r>
+      <w:proofErr w:type="spellEnd"/>
+      <w:r>
+        <w:t xml:space="preserve"> </w:t>
+      </w:r>
+      <w:proofErr w:type="spellStart"/>
+      <w:r>
+        <w:t>tipos</w:t>
+      </w:r>
+      <w:proofErr w:type="spellEnd"/>
+      <w:r>
+        <w:t xml:space="preserve"> de </w:t>
+      </w:r>
+      <w:proofErr w:type="spellStart"/>
+      <w:r>
+        <w:t>equipamentos</w:t>
+      </w:r>
+      <w:proofErr w:type="spellEnd"/>
+      <w:r>
+        <w:t>.</w:t>
       </w:r>
     </w:p>
+    <w:p/>
+    <w:p/>
     <w:p>
       <w:pPr>
         <w:pStyle w:val="Ttulo1"/>
@@ -1112,9 +1450,34 @@
     </w:p>
     <w:p>
       <w:r>
-        <w:t>O backend foi desenvolvido em Python 3 e reúne o servidor HTTP, a API REST e as regras de negócio da prova de conceito. As rotas recebem e retornam dados em JSON, realizam validações e utilizam o módulo sqlite3 para persistência.</w:t>
+        <w:t xml:space="preserve">O backend foi desenvolvido em Python 3 e reúne o servidor HTTP, a API REST e as regras de negócio da prova de conceito. As rotas recebem e retornam dados em JSON, realizam validações e </w:t>
+      </w:r>
+      <w:proofErr w:type="spellStart"/>
+      <w:r>
+        <w:t>utilizam</w:t>
+      </w:r>
+      <w:proofErr w:type="spellEnd"/>
+      <w:r>
+        <w:t xml:space="preserve"> o </w:t>
+      </w:r>
+      <w:proofErr w:type="spellStart"/>
+      <w:r>
+        <w:t>módulo</w:t>
+      </w:r>
+      <w:proofErr w:type="spellEnd"/>
+      <w:r>
+        <w:t xml:space="preserve"> sqlite3 para </w:t>
+      </w:r>
+      <w:proofErr w:type="spellStart"/>
+      <w:r>
+        <w:t>persistência</w:t>
+      </w:r>
+      <w:proofErr w:type="spellEnd"/>
+      <w:r>
+        <w:t>.</w:t>
       </w:r>
     </w:p>
+    <w:p/>
     <w:p>
       <w:pPr>
         <w:pStyle w:val="Ttulo2"/>
@@ -1186,6 +1549,7 @@
         <w:ind w:left="709" w:hanging="283"/>
       </w:pPr>
       <w:r>
+        <w:lastRenderedPageBreak/>
         <w:t>O cancelamento altera o status da consulta para CANCELADA, preservando o histórico;</w:t>
       </w:r>
     </w:p>
@@ -1195,8 +1559,34 @@
         <w:ind w:left="709" w:hanging="283"/>
       </w:pPr>
       <w:r>
-        <w:t>O reagendamento verifica novamente a disponibilidade antes de atualizar a consulta.</w:t>
-      </w:r>
+        <w:t xml:space="preserve">O reagendamento verifica novamente a </w:t>
+      </w:r>
+      <w:proofErr w:type="spellStart"/>
+      <w:r>
+        <w:t>disponibilidade</w:t>
+      </w:r>
+      <w:proofErr w:type="spellEnd"/>
+      <w:r>
+        <w:t xml:space="preserve"> antes de </w:t>
+      </w:r>
+      <w:proofErr w:type="spellStart"/>
+      <w:r>
+        <w:t>atualizar</w:t>
+      </w:r>
+      <w:proofErr w:type="spellEnd"/>
+      <w:r>
+        <w:t xml:space="preserve"> a consulta.</w:t>
+      </w:r>
+    </w:p>
+    <w:p>
+      <w:pPr>
+        <w:pStyle w:val="Commarcadores"/>
+        <w:numPr>
+          <w:ilvl w:val="0"/>
+          <w:numId w:val="0"/>
+        </w:numPr>
+        <w:ind w:left="709"/>
+      </w:pPr>
     </w:p>
     <w:p>
       <w:pPr>
@@ -1453,14 +1843,61 @@
         <w:spacing w:line="240" w:lineRule="auto"/>
         <w:ind w:firstLine="0"/>
         <w:jc w:val="center"/>
-      </w:pPr>
-      <w:r>
         <w:rPr>
           <w:i/>
         </w:rPr>
-        <w:lastRenderedPageBreak/>
-        <w:t>Fonte: Elaboração autoral.</w:t>
-      </w:r>
+      </w:pPr>
+      <w:r>
+        <w:rPr>
+          <w:i/>
+        </w:rPr>
+        <w:t xml:space="preserve">Fonte: </w:t>
+      </w:r>
+      <w:proofErr w:type="spellStart"/>
+      <w:r>
+        <w:rPr>
+          <w:i/>
+        </w:rPr>
+        <w:t>Elaboração</w:t>
+      </w:r>
+      <w:proofErr w:type="spellEnd"/>
+      <w:r>
+        <w:rPr>
+          <w:i/>
+        </w:rPr>
+        <w:t xml:space="preserve"> </w:t>
+      </w:r>
+      <w:proofErr w:type="spellStart"/>
+      <w:r>
+        <w:rPr>
+          <w:i/>
+        </w:rPr>
+        <w:t>autoral</w:t>
+      </w:r>
+      <w:proofErr w:type="spellEnd"/>
+      <w:r>
+        <w:rPr>
+          <w:i/>
+        </w:rPr>
+        <w:t>.</w:t>
+      </w:r>
+    </w:p>
+    <w:p>
+      <w:pPr>
+        <w:spacing w:line="240" w:lineRule="auto"/>
+        <w:ind w:firstLine="0"/>
+        <w:jc w:val="center"/>
+        <w:rPr>
+          <w:i/>
+        </w:rPr>
+      </w:pPr>
+    </w:p>
+    <w:p>
+      <w:pPr>
+        <w:spacing w:line="240" w:lineRule="auto"/>
+        <w:ind w:firstLine="0"/>
+        <w:jc w:val="center"/>
+      </w:pPr>
     </w:p>
     <w:p>
       <w:pPr>
@@ -1475,94 +1912,183 @@
     </w:p>
     <w:p>
       <w:r>
-        <w:t>O fluxo implementado pode ser executado integralmente pelo navegador e foi construído para representar a jornada definida na primeira entrega.</w:t>
+        <w:t xml:space="preserve">O fluxo implementado pode ser executado integralmente pelo navegador e foi construído para </w:t>
+      </w:r>
+      <w:proofErr w:type="spellStart"/>
+      <w:r>
+        <w:t>representar</w:t>
+      </w:r>
+      <w:proofErr w:type="spellEnd"/>
+      <w:r>
+        <w:t xml:space="preserve"> a jornada </w:t>
+      </w:r>
+      <w:proofErr w:type="spellStart"/>
+      <w:r>
+        <w:t>definida</w:t>
+      </w:r>
+      <w:proofErr w:type="spellEnd"/>
+      <w:r>
+        <w:t xml:space="preserve"> </w:t>
+      </w:r>
+      <w:proofErr w:type="spellStart"/>
+      <w:r>
+        <w:t>na</w:t>
+      </w:r>
+      <w:proofErr w:type="spellEnd"/>
+      <w:r>
+        <w:t xml:space="preserve"> </w:t>
+      </w:r>
+      <w:proofErr w:type="spellStart"/>
+      <w:r>
+        <w:t>primeira</w:t>
+      </w:r>
+      <w:proofErr w:type="spellEnd"/>
+      <w:r>
+        <w:t xml:space="preserve"> </w:t>
+      </w:r>
+      <w:proofErr w:type="spellStart"/>
+      <w:r>
+        <w:t>entrega</w:t>
+      </w:r>
+      <w:proofErr w:type="spellEnd"/>
+      <w:r>
+        <w:t>.</w:t>
+      </w:r>
+    </w:p>
+    <w:p/>
+    <w:p>
+      <w:pPr>
+        <w:pStyle w:val="Commarcadores"/>
+        <w:numPr>
+          <w:ilvl w:val="0"/>
+          <w:numId w:val="0"/>
+        </w:numPr>
+        <w:ind w:left="426"/>
+      </w:pPr>
+      <w:r>
+        <w:t>1. O paciente acessa a página inicial do AgendaSaúde.</w:t>
       </w:r>
     </w:p>
     <w:p>
       <w:pPr>
         <w:pStyle w:val="Commarcadores"/>
-        <w:ind w:left="709" w:hanging="283"/>
-      </w:pPr>
-      <w:r>
-        <w:t>1. O paciente acessa a página inicial do AgendaSaúde.</w:t>
+        <w:numPr>
+          <w:ilvl w:val="0"/>
+          <w:numId w:val="0"/>
+        </w:numPr>
+        <w:ind w:left="426"/>
+      </w:pPr>
+      <w:r>
+        <w:t>2. O paciente realiza login com uma conta existente ou cria um novo cadastro.</w:t>
       </w:r>
     </w:p>
     <w:p>
       <w:pPr>
         <w:pStyle w:val="Commarcadores"/>
-        <w:ind w:left="709" w:hanging="283"/>
-      </w:pPr>
-      <w:r>
-        <w:t>2. O paciente realiza login com uma conta existente ou cria um novo cadastro.</w:t>
+        <w:numPr>
+          <w:ilvl w:val="0"/>
+          <w:numId w:val="0"/>
+        </w:numPr>
+        <w:ind w:left="426"/>
+      </w:pPr>
+      <w:r>
+        <w:t>3. O sistema apresenta a área do paciente e o formulário de agendamento.</w:t>
       </w:r>
     </w:p>
     <w:p>
       <w:pPr>
         <w:pStyle w:val="Commarcadores"/>
-        <w:ind w:left="709" w:hanging="283"/>
-      </w:pPr>
-      <w:r>
-        <w:t>3. O sistema apresenta a área do paciente e o formulário de agendamento.</w:t>
+        <w:numPr>
+          <w:ilvl w:val="0"/>
+          <w:numId w:val="0"/>
+        </w:numPr>
+        <w:ind w:left="426"/>
+      </w:pPr>
+      <w:r>
+        <w:t>4. O paciente escolhe profissional/especialidade e uma data.</w:t>
       </w:r>
     </w:p>
     <w:p>
       <w:pPr>
         <w:pStyle w:val="Commarcadores"/>
-        <w:ind w:left="709" w:hanging="283"/>
-      </w:pPr>
-      <w:r>
-        <w:t>4. O paciente escolhe profissional/especialidade e uma data.</w:t>
+        <w:numPr>
+          <w:ilvl w:val="0"/>
+          <w:numId w:val="0"/>
+        </w:numPr>
+        <w:ind w:left="426"/>
+      </w:pPr>
+      <w:r>
+        <w:t>5. O frontend solicita ao backend os horários livres para a combinação selecionada.</w:t>
       </w:r>
     </w:p>
     <w:p>
       <w:pPr>
         <w:pStyle w:val="Commarcadores"/>
-        <w:ind w:left="709" w:hanging="283"/>
-      </w:pPr>
-      <w:r>
-        <w:t>5. O frontend solicita ao backend os horários livres para a combinação selecionada.</w:t>
+        <w:numPr>
+          <w:ilvl w:val="0"/>
+          <w:numId w:val="0"/>
+        </w:numPr>
+        <w:ind w:left="426"/>
+      </w:pPr>
+      <w:r>
+        <w:t>6. O paciente escolhe um dos horários retornados e confirma.</w:t>
       </w:r>
     </w:p>
     <w:p>
       <w:pPr>
         <w:pStyle w:val="Commarcadores"/>
-        <w:ind w:left="709" w:hanging="283"/>
-      </w:pPr>
-      <w:r>
-        <w:t>6. O paciente escolhe um dos horários retornados e confirma.</w:t>
+        <w:numPr>
+          <w:ilvl w:val="0"/>
+          <w:numId w:val="0"/>
+        </w:numPr>
+        <w:ind w:left="426"/>
+      </w:pPr>
+      <w:r>
+        <w:t>7. O backend valida a solicitação, impede conflitos e registra a consulta no SQLite.</w:t>
       </w:r>
     </w:p>
     <w:p>
       <w:pPr>
         <w:pStyle w:val="Commarcadores"/>
-        <w:ind w:left="709" w:hanging="283"/>
-      </w:pPr>
-      <w:r>
-        <w:t>7. O backend valida a solicitação, impede conflitos e registra a consulta no SQLite.</w:t>
+        <w:numPr>
+          <w:ilvl w:val="0"/>
+          <w:numId w:val="0"/>
+        </w:numPr>
+        <w:ind w:left="426"/>
+      </w:pPr>
+      <w:r>
+        <w:t xml:space="preserve">8. A consulta passa </w:t>
+      </w:r>
+      <w:proofErr w:type="gramStart"/>
+      <w:r>
+        <w:t>a</w:t>
+      </w:r>
+      <w:proofErr w:type="gramEnd"/>
+      <w:r>
+        <w:t xml:space="preserve"> aparecer no histórico do paciente.</w:t>
       </w:r>
     </w:p>
     <w:p>
       <w:pPr>
         <w:pStyle w:val="Commarcadores"/>
-        <w:ind w:left="709" w:hanging="283"/>
-      </w:pPr>
-      <w:r>
-        <w:t>8. A consulta passa a aparecer no histórico do paciente.</w:t>
+        <w:numPr>
+          <w:ilvl w:val="0"/>
+          <w:numId w:val="0"/>
+        </w:numPr>
+        <w:ind w:left="426"/>
+      </w:pPr>
+      <w:r>
+        <w:t>9. Caso necessário, o paciente pode cancelar ou iniciar o reagendamento.</w:t>
       </w:r>
     </w:p>
     <w:p>
       <w:pPr>
         <w:pStyle w:val="Commarcadores"/>
-        <w:ind w:left="709" w:hanging="283"/>
-      </w:pPr>
-      <w:r>
-        <w:t>9. Caso necessário, o paciente pode cancelar ou iniciar o reagendamento.</w:t>
-      </w:r>
-    </w:p>
-    <w:p>
-      <w:pPr>
-        <w:pStyle w:val="Commarcadores"/>
-        <w:ind w:left="709" w:hanging="283"/>
+        <w:numPr>
+          <w:ilvl w:val="0"/>
+          <w:numId w:val="0"/>
+        </w:numPr>
+        <w:ind w:left="426"/>
       </w:pPr>
       <w:r>
         <w:t>10. O backend atualiza o registro e o frontend apresenta a nova situação.</w:t>
@@ -1576,6 +2102,7 @@
         <w:rPr>
           <w:rFonts w:ascii="Times New Roman" w:eastAsia="Times New Roman" w:hAnsi="Times New Roman"/>
         </w:rPr>
+        <w:lastRenderedPageBreak/>
         <w:t>8. ORGANIZAÇÃO DO REPOSITÓRIO NO GITHUB</w:t>
       </w:r>
     </w:p>
@@ -1654,6 +2181,223 @@
               <w:jc w:val="left"/>
             </w:pPr>
             <w:r>
+              <w:t>backend/</w:t>
+            </w:r>
+          </w:p>
+        </w:tc>
+        <w:tc>
+          <w:tcPr>
+            <w:tcW w:w="4419" w:type="dxa"/>
+            <w:vAlign w:val="center"/>
+          </w:tcPr>
+          <w:p>
+            <w:pPr>
+              <w:spacing w:line="240" w:lineRule="auto"/>
+              <w:ind w:firstLine="0"/>
+              <w:jc w:val="left"/>
+            </w:pPr>
+            <w:proofErr w:type="spellStart"/>
+            <w:r>
+              <w:t>Servidor</w:t>
+            </w:r>
+            <w:proofErr w:type="spellEnd"/>
+            <w:r>
+              <w:t xml:space="preserve"> e API </w:t>
+            </w:r>
+            <w:proofErr w:type="spellStart"/>
+            <w:r>
+              <w:t>em</w:t>
+            </w:r>
+            <w:proofErr w:type="spellEnd"/>
+            <w:r>
+              <w:t xml:space="preserve"> Python.</w:t>
+            </w:r>
+          </w:p>
+        </w:tc>
+      </w:tr>
+      <w:tr>
+        <w:trPr>
+          <w:jc w:val="center"/>
+        </w:trPr>
+        <w:tc>
+          <w:tcPr>
+            <w:tcW w:w="4419" w:type="dxa"/>
+            <w:vAlign w:val="center"/>
+          </w:tcPr>
+          <w:p>
+            <w:pPr>
+              <w:spacing w:line="240" w:lineRule="auto"/>
+              <w:ind w:firstLine="0"/>
+              <w:jc w:val="left"/>
+            </w:pPr>
+            <w:r>
+              <w:t>database/</w:t>
+            </w:r>
+          </w:p>
+        </w:tc>
+        <w:tc>
+          <w:tcPr>
+            <w:tcW w:w="4419" w:type="dxa"/>
+            <w:vAlign w:val="center"/>
+          </w:tcPr>
+          <w:p>
+            <w:pPr>
+              <w:spacing w:line="240" w:lineRule="auto"/>
+              <w:ind w:firstLine="0"/>
+              <w:jc w:val="left"/>
+            </w:pPr>
+            <w:proofErr w:type="spellStart"/>
+            <w:r>
+              <w:t>schema.sql</w:t>
+            </w:r>
+            <w:proofErr w:type="spellEnd"/>
+            <w:r>
+              <w:t xml:space="preserve">, </w:t>
+            </w:r>
+            <w:proofErr w:type="spellStart"/>
+            <w:r>
+              <w:t>seed.sql</w:t>
+            </w:r>
+            <w:proofErr w:type="spellEnd"/>
+            <w:r>
+              <w:t xml:space="preserve"> e </w:t>
+            </w:r>
+            <w:proofErr w:type="spellStart"/>
+            <w:r>
+              <w:t>orientações</w:t>
+            </w:r>
+            <w:proofErr w:type="spellEnd"/>
+            <w:r>
+              <w:t xml:space="preserve"> do SQLite.</w:t>
+            </w:r>
+          </w:p>
+        </w:tc>
+      </w:tr>
+      <w:tr>
+        <w:trPr>
+          <w:jc w:val="center"/>
+        </w:trPr>
+        <w:tc>
+          <w:tcPr>
+            <w:tcW w:w="4419" w:type="dxa"/>
+            <w:vAlign w:val="center"/>
+          </w:tcPr>
+          <w:p>
+            <w:pPr>
+              <w:spacing w:line="240" w:lineRule="auto"/>
+              <w:ind w:firstLine="0"/>
+              <w:jc w:val="left"/>
+            </w:pPr>
+            <w:r>
+              <w:t>docs/</w:t>
+            </w:r>
+          </w:p>
+        </w:tc>
+        <w:tc>
+          <w:tcPr>
+            <w:tcW w:w="4419" w:type="dxa"/>
+            <w:vAlign w:val="center"/>
+          </w:tcPr>
+          <w:p>
+            <w:pPr>
+              <w:spacing w:line="240" w:lineRule="auto"/>
+              <w:ind w:firstLine="0"/>
+              <w:jc w:val="left"/>
+            </w:pPr>
+            <w:proofErr w:type="spellStart"/>
+            <w:r>
+              <w:t>Documentação</w:t>
+            </w:r>
+            <w:proofErr w:type="spellEnd"/>
+            <w:r>
+              <w:t xml:space="preserve"> </w:t>
+            </w:r>
+            <w:proofErr w:type="spellStart"/>
+            <w:r>
+              <w:t>técnica</w:t>
+            </w:r>
+            <w:proofErr w:type="spellEnd"/>
+            <w:r>
+              <w:t xml:space="preserve">, </w:t>
+            </w:r>
+            <w:proofErr w:type="spellStart"/>
+            <w:r>
+              <w:t>acadêmica</w:t>
+            </w:r>
+            <w:proofErr w:type="spellEnd"/>
+            <w:r>
+              <w:t xml:space="preserve">, API, </w:t>
+            </w:r>
+            <w:proofErr w:type="spellStart"/>
+            <w:r>
+              <w:t>arquitetura</w:t>
+            </w:r>
+            <w:proofErr w:type="spellEnd"/>
+            <w:r>
+              <w:t xml:space="preserve"> e </w:t>
+            </w:r>
+            <w:proofErr w:type="spellStart"/>
+            <w:r>
+              <w:t>roteiro</w:t>
+            </w:r>
+            <w:proofErr w:type="spellEnd"/>
+            <w:r>
+              <w:t xml:space="preserve"> do </w:t>
+            </w:r>
+            <w:proofErr w:type="spellStart"/>
+            <w:r>
+              <w:t>vídeo</w:t>
+            </w:r>
+            <w:proofErr w:type="spellEnd"/>
+            <w:r>
+              <w:t>.</w:t>
+            </w:r>
+            <w:r>
+              <w:t xml:space="preserve"> </w:t>
+            </w:r>
+            <w:proofErr w:type="spellStart"/>
+            <w:r>
+              <w:t>Incluída</w:t>
+            </w:r>
+            <w:proofErr w:type="spellEnd"/>
+            <w:r>
+              <w:t xml:space="preserve"> a </w:t>
+            </w:r>
+            <w:proofErr w:type="spellStart"/>
+            <w:r>
+              <w:t>documentação</w:t>
+            </w:r>
+            <w:proofErr w:type="spellEnd"/>
+            <w:r>
+              <w:t xml:space="preserve"> da </w:t>
+            </w:r>
+            <w:proofErr w:type="spellStart"/>
+            <w:r>
+              <w:t>Primeira</w:t>
+            </w:r>
+            <w:proofErr w:type="spellEnd"/>
+            <w:r>
+              <w:t xml:space="preserve"> Etapa.</w:t>
+            </w:r>
+          </w:p>
+        </w:tc>
+      </w:tr>
+      <w:tr>
+        <w:trPr>
+          <w:jc w:val="center"/>
+        </w:trPr>
+        <w:tc>
+          <w:tcPr>
+            <w:tcW w:w="4419" w:type="dxa"/>
+            <w:vAlign w:val="center"/>
+          </w:tcPr>
+          <w:p>
+            <w:pPr>
+              <w:spacing w:line="240" w:lineRule="auto"/>
+              <w:ind w:firstLine="0"/>
+              <w:jc w:val="left"/>
+            </w:pPr>
+            <w:r>
               <w:t>frontend/</w:t>
             </w:r>
           </w:p>
@@ -1691,7 +2435,7 @@
               <w:jc w:val="left"/>
             </w:pPr>
             <w:r>
-              <w:t>backend/</w:t>
+              <w:t>scripts/</w:t>
             </w:r>
           </w:p>
         </w:tc>
@@ -1707,7 +2451,15 @@
               <w:jc w:val="left"/>
             </w:pPr>
             <w:r>
-              <w:t>Servidor e API em Python.</w:t>
+              <w:t xml:space="preserve">Teste </w:t>
+            </w:r>
+            <w:proofErr w:type="spellStart"/>
+            <w:r>
+              <w:t>rápido</w:t>
+            </w:r>
+            <w:proofErr w:type="spellEnd"/>
+            <w:r>
+              <w:t xml:space="preserve"> da API.</w:t>
             </w:r>
           </w:p>
         </w:tc>
@@ -1728,7 +2480,7 @@
               <w:jc w:val="left"/>
             </w:pPr>
             <w:r>
-              <w:t>database/</w:t>
+              <w:t>tests/</w:t>
             </w:r>
           </w:p>
         </w:tc>
@@ -1744,82 +2496,24 @@
               <w:jc w:val="left"/>
             </w:pPr>
             <w:r>
-              <w:t>schema.sql, seed.sql e orientações do SQLite.</w:t>
+              <w:t xml:space="preserve">Testes </w:t>
             </w:r>
-          </w:p>
-        </w:tc>
-      </w:tr>
-      <w:tr>
-        <w:trPr>
-          <w:jc w:val="center"/>
-        </w:trPr>
-        <w:tc>
-          <w:tcPr>
-            <w:tcW w:w="4419" w:type="dxa"/>
-            <w:vAlign w:val="center"/>
-          </w:tcPr>
-          <w:p>
-            <w:pPr>
-              <w:spacing w:line="240" w:lineRule="auto"/>
-              <w:ind w:firstLine="0"/>
-              <w:jc w:val="left"/>
-            </w:pPr>
+            <w:proofErr w:type="spellStart"/>
             <w:r>
-              <w:t>docs/</w:t>
+              <w:t>específicos</w:t>
             </w:r>
-          </w:p>
-        </w:tc>
-        <w:tc>
-          <w:tcPr>
-            <w:tcW w:w="4419" w:type="dxa"/>
-            <w:vAlign w:val="center"/>
-          </w:tcPr>
-          <w:p>
-            <w:pPr>
-              <w:spacing w:line="240" w:lineRule="auto"/>
-              <w:ind w:firstLine="0"/>
-              <w:jc w:val="left"/>
-            </w:pPr>
+            <w:proofErr w:type="spellEnd"/>
             <w:r>
-              <w:t>Documentação técnica, acadêmica, API, arquitetura e roteiro do vídeo.</w:t>
+              <w:t xml:space="preserve"> e </w:t>
             </w:r>
-          </w:p>
-        </w:tc>
-      </w:tr>
-      <w:tr>
-        <w:trPr>
-          <w:jc w:val="center"/>
-        </w:trPr>
-        <w:tc>
-          <w:tcPr>
-            <w:tcW w:w="4419" w:type="dxa"/>
-            <w:vAlign w:val="center"/>
-          </w:tcPr>
-          <w:p>
-            <w:pPr>
-              <w:spacing w:line="240" w:lineRule="auto"/>
-              <w:ind w:firstLine="0"/>
-              <w:jc w:val="left"/>
-            </w:pPr>
             <w:r>
-              <w:t>scripts/</w:t>
+              <w:t xml:space="preserve">Testes </w:t>
             </w:r>
-          </w:p>
-        </w:tc>
-        <w:tc>
-          <w:tcPr>
-            <w:tcW w:w="4419" w:type="dxa"/>
-            <w:vAlign w:val="center"/>
-          </w:tcPr>
-          <w:p>
-            <w:pPr>
-              <w:spacing w:line="240" w:lineRule="auto"/>
-              <w:ind w:firstLine="0"/>
-              <w:jc w:val="left"/>
-            </w:pPr>
+            <w:proofErr w:type="spellStart"/>
             <w:r>
-              <w:t>Teste rápido da API.</w:t>
+              <w:t>automatizados</w:t>
             </w:r>
+            <w:proofErr w:type="spellEnd"/>
           </w:p>
         </w:tc>
       </w:tr>
@@ -1854,8 +2548,192 @@
               <w:ind w:firstLine="0"/>
               <w:jc w:val="left"/>
             </w:pPr>
+            <w:proofErr w:type="spellStart"/>
             <w:r>
-              <w:t>Local indicado para MP4 ou link do vídeo.</w:t>
+              <w:t>V</w:t>
+            </w:r>
+            <w:r>
+              <w:t>ídeo</w:t>
+            </w:r>
+            <w:proofErr w:type="spellEnd"/>
+            <w:r>
+              <w:t xml:space="preserve"> de </w:t>
+            </w:r>
+            <w:proofErr w:type="spellStart"/>
+            <w:r>
+              <w:t>demonstração</w:t>
+            </w:r>
+            <w:proofErr w:type="spellEnd"/>
+            <w:r>
+              <w:t xml:space="preserve"> do </w:t>
+            </w:r>
+            <w:r>
+              <w:t xml:space="preserve">Sistema </w:t>
+            </w:r>
+            <w:proofErr w:type="spellStart"/>
+            <w:r>
+              <w:t>em</w:t>
+            </w:r>
+            <w:proofErr w:type="spellEnd"/>
+            <w:r>
+              <w:t xml:space="preserve"> </w:t>
+            </w:r>
+            <w:proofErr w:type="spellStart"/>
+            <w:r>
+              <w:t>formato</w:t>
+            </w:r>
+            <w:proofErr w:type="spellEnd"/>
+            <w:r>
+              <w:t xml:space="preserve"> MP4.</w:t>
+            </w:r>
+          </w:p>
+        </w:tc>
+      </w:tr>
+      <w:tr>
+        <w:trPr>
+          <w:jc w:val="center"/>
+        </w:trPr>
+        <w:tc>
+          <w:tcPr>
+            <w:tcW w:w="4419" w:type="dxa"/>
+            <w:vAlign w:val="center"/>
+          </w:tcPr>
+          <w:p>
+            <w:pPr>
+              <w:spacing w:line="240" w:lineRule="auto"/>
+              <w:ind w:firstLine="0"/>
+              <w:jc w:val="left"/>
+            </w:pPr>
+            <w:proofErr w:type="gramStart"/>
+            <w:r>
+              <w:t>.</w:t>
+            </w:r>
+            <w:proofErr w:type="spellStart"/>
+            <w:r>
+              <w:t>gitignore</w:t>
+            </w:r>
+            <w:proofErr w:type="spellEnd"/>
+            <w:proofErr w:type="gramEnd"/>
+          </w:p>
+        </w:tc>
+        <w:tc>
+          <w:tcPr>
+            <w:tcW w:w="4419" w:type="dxa"/>
+            <w:vAlign w:val="center"/>
+          </w:tcPr>
+          <w:p>
+            <w:pPr>
+              <w:spacing w:line="240" w:lineRule="auto"/>
+              <w:ind w:firstLine="0"/>
+              <w:jc w:val="left"/>
+            </w:pPr>
+            <w:r>
+              <w:t xml:space="preserve">Com base </w:t>
+            </w:r>
+            <w:proofErr w:type="spellStart"/>
+            <w:r>
+              <w:t>na</w:t>
+            </w:r>
+            <w:proofErr w:type="spellEnd"/>
+            <w:r>
+              <w:t xml:space="preserve"> </w:t>
+            </w:r>
+            <w:proofErr w:type="spellStart"/>
+            <w:r>
+              <w:t>arquiterua</w:t>
+            </w:r>
+            <w:proofErr w:type="spellEnd"/>
+          </w:p>
+        </w:tc>
+      </w:tr>
+      <w:tr>
+        <w:trPr>
+          <w:jc w:val="center"/>
+        </w:trPr>
+        <w:tc>
+          <w:tcPr>
+            <w:tcW w:w="4419" w:type="dxa"/>
+            <w:vAlign w:val="center"/>
+          </w:tcPr>
+          <w:p>
+            <w:pPr>
+              <w:spacing w:line="240" w:lineRule="auto"/>
+              <w:ind w:firstLine="0"/>
+              <w:jc w:val="left"/>
+            </w:pPr>
+            <w:r>
+              <w:t>CHANGELOG.md</w:t>
+            </w:r>
+          </w:p>
+        </w:tc>
+        <w:tc>
+          <w:tcPr>
+            <w:tcW w:w="4419" w:type="dxa"/>
+            <w:vAlign w:val="center"/>
+          </w:tcPr>
+          <w:p>
+            <w:pPr>
+              <w:spacing w:line="240" w:lineRule="auto"/>
+              <w:ind w:firstLine="0"/>
+              <w:jc w:val="left"/>
+            </w:pPr>
+            <w:proofErr w:type="spellStart"/>
+            <w:r>
+              <w:t>Itens</w:t>
+            </w:r>
+            <w:proofErr w:type="spellEnd"/>
+            <w:r>
+              <w:t xml:space="preserve"> da </w:t>
+            </w:r>
+            <w:proofErr w:type="spellStart"/>
+            <w:r>
+              <w:t>Prova</w:t>
+            </w:r>
+            <w:proofErr w:type="spellEnd"/>
+            <w:r>
+              <w:t xml:space="preserve"> de </w:t>
+            </w:r>
+            <w:proofErr w:type="spellStart"/>
+            <w:r>
+              <w:t>conceito</w:t>
+            </w:r>
+            <w:proofErr w:type="spellEnd"/>
+          </w:p>
+        </w:tc>
+      </w:tr>
+      <w:tr>
+        <w:trPr>
+          <w:jc w:val="center"/>
+        </w:trPr>
+        <w:tc>
+          <w:tcPr>
+            <w:tcW w:w="4419" w:type="dxa"/>
+            <w:vAlign w:val="center"/>
+          </w:tcPr>
+          <w:p>
+            <w:pPr>
+              <w:spacing w:line="240" w:lineRule="auto"/>
+              <w:ind w:firstLine="0"/>
+              <w:jc w:val="left"/>
+            </w:pPr>
+            <w:r>
+              <w:t>LICENSE</w:t>
+            </w:r>
+          </w:p>
+        </w:tc>
+        <w:tc>
+          <w:tcPr>
+            <w:tcW w:w="4419" w:type="dxa"/>
+            <w:vAlign w:val="center"/>
+          </w:tcPr>
+          <w:p>
+            <w:pPr>
+              <w:spacing w:line="240" w:lineRule="auto"/>
+              <w:ind w:firstLine="0"/>
+              <w:jc w:val="left"/>
+            </w:pPr>
+            <w:r>
+              <w:t>MIT License</w:t>
             </w:r>
           </w:p>
         </w:tc>
@@ -1928,8 +2806,21 @@
               <w:ind w:firstLine="0"/>
               <w:jc w:val="left"/>
             </w:pPr>
+            <w:proofErr w:type="spellStart"/>
             <w:r>
-              <w:t>Orientações de colaboração e commits.</w:t>
+              <w:t>Orientações</w:t>
+            </w:r>
+            <w:proofErr w:type="spellEnd"/>
+            <w:r>
+              <w:t xml:space="preserve"> de </w:t>
+            </w:r>
+            <w:proofErr w:type="spellStart"/>
+            <w:r>
+              <w:t>colaboração</w:t>
+            </w:r>
+            <w:proofErr w:type="spellEnd"/>
+            <w:r>
+              <w:t xml:space="preserve"> e commits.</w:t>
             </w:r>
           </w:p>
         </w:tc>
@@ -1940,20 +2831,703 @@
         <w:spacing w:line="240" w:lineRule="auto"/>
         <w:ind w:firstLine="0"/>
         <w:jc w:val="center"/>
-      </w:pPr>
-      <w:r>
         <w:rPr>
           <w:i/>
         </w:rPr>
-        <w:t>Fonte: Elaboração autoral.</w:t>
+      </w:pPr>
+      <w:r>
+        <w:rPr>
+          <w:i/>
+        </w:rPr>
+        <w:t xml:space="preserve">Fonte: </w:t>
+      </w:r>
+      <w:proofErr w:type="spellStart"/>
+      <w:r>
+        <w:rPr>
+          <w:i/>
+        </w:rPr>
+        <w:t>Elaboração</w:t>
+      </w:r>
+      <w:proofErr w:type="spellEnd"/>
+      <w:r>
+        <w:rPr>
+          <w:i/>
+        </w:rPr>
+        <w:t xml:space="preserve"> </w:t>
+      </w:r>
+      <w:proofErr w:type="spellStart"/>
+      <w:r>
+        <w:rPr>
+          <w:i/>
+        </w:rPr>
+        <w:t>autoral</w:t>
+      </w:r>
+      <w:proofErr w:type="spellEnd"/>
+      <w:r>
+        <w:rPr>
+          <w:i/>
+        </w:rPr>
+        <w:t>.</w:t>
       </w:r>
     </w:p>
     <w:p>
-      <w:r>
-        <w:lastRenderedPageBreak/>
-        <w:t>Todos os integrantes deverão ser adicionados como colaboradores no GitHub e realizar contribuições reais no repositório, uma vez que a atividade solicita histórico de colaboração de cada membro. O arquivo PLANO_COLABORACAO_GITHUB.md apresenta sugestões de alterações que podem ser distribuídas entre os participantes sem criar histórico artificial.</w:t>
-      </w:r>
+      <w:pPr>
+        <w:spacing w:line="240" w:lineRule="auto"/>
+        <w:ind w:firstLine="0"/>
+        <w:jc w:val="center"/>
+      </w:pPr>
     </w:p>
+    <w:p>
+      <w:r>
+        <w:t xml:space="preserve">Todos </w:t>
+      </w:r>
+      <w:proofErr w:type="spellStart"/>
+      <w:r>
+        <w:t>os</w:t>
+      </w:r>
+      <w:proofErr w:type="spellEnd"/>
+      <w:r>
+        <w:t xml:space="preserve"> </w:t>
+      </w:r>
+      <w:proofErr w:type="spellStart"/>
+      <w:r>
+        <w:t>integrantes</w:t>
+      </w:r>
+      <w:proofErr w:type="spellEnd"/>
+      <w:r>
+        <w:t xml:space="preserve"> </w:t>
+      </w:r>
+      <w:proofErr w:type="spellStart"/>
+      <w:r>
+        <w:t>ativos</w:t>
+      </w:r>
+      <w:proofErr w:type="spellEnd"/>
+      <w:r>
+        <w:t xml:space="preserve"> </w:t>
+      </w:r>
+      <w:proofErr w:type="spellStart"/>
+      <w:r>
+        <w:t>na</w:t>
+      </w:r>
+      <w:proofErr w:type="spellEnd"/>
+      <w:r>
+        <w:t xml:space="preserve"> </w:t>
+      </w:r>
+      <w:proofErr w:type="spellStart"/>
+      <w:r>
+        <w:t>elaboração</w:t>
+      </w:r>
+      <w:proofErr w:type="spellEnd"/>
+      <w:r>
+        <w:t xml:space="preserve"> do </w:t>
+      </w:r>
+      <w:proofErr w:type="spellStart"/>
+      <w:r>
+        <w:t>Projeto</w:t>
+      </w:r>
+      <w:proofErr w:type="spellEnd"/>
+      <w:r>
+        <w:t xml:space="preserve"> de Segunda Entrega </w:t>
+      </w:r>
+      <w:proofErr w:type="spellStart"/>
+      <w:r>
+        <w:t>constam</w:t>
+      </w:r>
+      <w:proofErr w:type="spellEnd"/>
+      <w:r>
+        <w:t xml:space="preserve"> </w:t>
+      </w:r>
+      <w:proofErr w:type="spellStart"/>
+      <w:r>
+        <w:t>em</w:t>
+      </w:r>
+      <w:proofErr w:type="spellEnd"/>
+      <w:r>
+        <w:t xml:space="preserve"> “Contributors” no </w:t>
+      </w:r>
+      <w:proofErr w:type="spellStart"/>
+      <w:r>
+        <w:t>repositório</w:t>
+      </w:r>
+      <w:proofErr w:type="spellEnd"/>
+      <w:r>
+        <w:t xml:space="preserve"> Git Hub, e </w:t>
+      </w:r>
+      <w:proofErr w:type="spellStart"/>
+      <w:r>
+        <w:t>cada</w:t>
+      </w:r>
+      <w:proofErr w:type="spellEnd"/>
+      <w:r>
+        <w:t xml:space="preserve"> </w:t>
+      </w:r>
+      <w:proofErr w:type="spellStart"/>
+      <w:r>
+        <w:t>atividade</w:t>
+      </w:r>
+      <w:proofErr w:type="spellEnd"/>
+      <w:r>
+        <w:t xml:space="preserve"> </w:t>
+      </w:r>
+      <w:proofErr w:type="spellStart"/>
+      <w:r>
+        <w:t>pode</w:t>
+      </w:r>
+      <w:proofErr w:type="spellEnd"/>
+      <w:r>
+        <w:t xml:space="preserve"> ser </w:t>
+      </w:r>
+      <w:proofErr w:type="spellStart"/>
+      <w:r>
+        <w:t>conferida</w:t>
+      </w:r>
+      <w:proofErr w:type="spellEnd"/>
+      <w:r>
+        <w:t xml:space="preserve"> </w:t>
+      </w:r>
+      <w:proofErr w:type="spellStart"/>
+      <w:r>
+        <w:t>em</w:t>
+      </w:r>
+      <w:proofErr w:type="spellEnd"/>
+      <w:r>
+        <w:t xml:space="preserve"> Pull requests </w:t>
+      </w:r>
+      <w:proofErr w:type="spellStart"/>
+      <w:r>
+        <w:t>abertas</w:t>
+      </w:r>
+      <w:proofErr w:type="spellEnd"/>
+      <w:r>
+        <w:t xml:space="preserve"> e </w:t>
+      </w:r>
+      <w:proofErr w:type="spellStart"/>
+      <w:r>
+        <w:t>finalizadas</w:t>
+      </w:r>
+      <w:proofErr w:type="spellEnd"/>
+      <w:r>
+        <w:t xml:space="preserve">, </w:t>
+      </w:r>
+      <w:proofErr w:type="spellStart"/>
+      <w:r>
+        <w:t>assim</w:t>
+      </w:r>
+      <w:proofErr w:type="spellEnd"/>
+      <w:r>
+        <w:t xml:space="preserve"> </w:t>
+      </w:r>
+      <w:proofErr w:type="spellStart"/>
+      <w:r>
+        <w:t>como</w:t>
+      </w:r>
+      <w:proofErr w:type="spellEnd"/>
+      <w:r>
+        <w:t xml:space="preserve"> </w:t>
+      </w:r>
+      <w:proofErr w:type="spellStart"/>
+      <w:r>
+        <w:t>os</w:t>
+      </w:r>
+      <w:proofErr w:type="spellEnd"/>
+      <w:r>
+        <w:t xml:space="preserve"> </w:t>
+      </w:r>
+      <w:proofErr w:type="spellStart"/>
+      <w:r>
+        <w:t>respectivos</w:t>
+      </w:r>
+      <w:proofErr w:type="spellEnd"/>
+      <w:r>
+        <w:t xml:space="preserve"> “commits” de </w:t>
+      </w:r>
+      <w:proofErr w:type="spellStart"/>
+      <w:r>
+        <w:t>cada</w:t>
+      </w:r>
+      <w:proofErr w:type="spellEnd"/>
+      <w:r>
+        <w:t xml:space="preserve"> </w:t>
+      </w:r>
+      <w:proofErr w:type="spellStart"/>
+      <w:r>
+        <w:t>ação</w:t>
+      </w:r>
+      <w:proofErr w:type="spellEnd"/>
+      <w:r>
+        <w:t>.</w:t>
+      </w:r>
+    </w:p>
+    <w:p>
+      <w:r>
+        <w:t xml:space="preserve">O </w:t>
+      </w:r>
+      <w:proofErr w:type="spellStart"/>
+      <w:r>
+        <w:t>código-fonte</w:t>
+      </w:r>
+      <w:proofErr w:type="spellEnd"/>
+      <w:r>
+        <w:t xml:space="preserve">, a </w:t>
+      </w:r>
+      <w:proofErr w:type="spellStart"/>
+      <w:r>
+        <w:t>documentação</w:t>
+      </w:r>
+      <w:proofErr w:type="spellEnd"/>
+      <w:r>
+        <w:t xml:space="preserve">, </w:t>
+      </w:r>
+      <w:proofErr w:type="spellStart"/>
+      <w:r>
+        <w:t>os</w:t>
+      </w:r>
+      <w:proofErr w:type="spellEnd"/>
+      <w:r>
+        <w:t xml:space="preserve"> </w:t>
+      </w:r>
+      <w:proofErr w:type="spellStart"/>
+      <w:r>
+        <w:t>arquivos</w:t>
+      </w:r>
+      <w:proofErr w:type="spellEnd"/>
+      <w:r>
+        <w:t xml:space="preserve"> de </w:t>
+      </w:r>
+      <w:proofErr w:type="spellStart"/>
+      <w:r>
+        <w:t>configuração</w:t>
+      </w:r>
+      <w:proofErr w:type="spellEnd"/>
+      <w:r>
+        <w:t xml:space="preserve">, </w:t>
+      </w:r>
+      <w:proofErr w:type="spellStart"/>
+      <w:r>
+        <w:t>os</w:t>
+      </w:r>
+      <w:proofErr w:type="spellEnd"/>
+      <w:r>
+        <w:t xml:space="preserve"> scripts e </w:t>
+      </w:r>
+      <w:proofErr w:type="spellStart"/>
+      <w:r>
+        <w:t>os</w:t>
+      </w:r>
+      <w:proofErr w:type="spellEnd"/>
+      <w:r>
+        <w:t xml:space="preserve"> </w:t>
+      </w:r>
+      <w:proofErr w:type="spellStart"/>
+      <w:r>
+        <w:t>demais</w:t>
+      </w:r>
+      <w:proofErr w:type="spellEnd"/>
+      <w:r>
+        <w:t xml:space="preserve"> </w:t>
+      </w:r>
+      <w:proofErr w:type="spellStart"/>
+      <w:r>
+        <w:t>materiais</w:t>
+      </w:r>
+      <w:proofErr w:type="spellEnd"/>
+      <w:r>
+        <w:t xml:space="preserve"> </w:t>
+      </w:r>
+      <w:proofErr w:type="spellStart"/>
+      <w:r>
+        <w:t>relacionados</w:t>
+      </w:r>
+      <w:proofErr w:type="spellEnd"/>
+      <w:r>
+        <w:t xml:space="preserve"> à </w:t>
+      </w:r>
+      <w:proofErr w:type="spellStart"/>
+      <w:r>
+        <w:t>prova</w:t>
+      </w:r>
+      <w:proofErr w:type="spellEnd"/>
+      <w:r>
+        <w:t xml:space="preserve"> de </w:t>
+      </w:r>
+      <w:proofErr w:type="spellStart"/>
+      <w:r>
+        <w:t>conceito</w:t>
+      </w:r>
+      <w:proofErr w:type="spellEnd"/>
+      <w:r>
+        <w:t xml:space="preserve"> </w:t>
+      </w:r>
+      <w:proofErr w:type="spellStart"/>
+      <w:r>
+        <w:t>estão</w:t>
+      </w:r>
+      <w:proofErr w:type="spellEnd"/>
+      <w:r>
+        <w:t xml:space="preserve"> </w:t>
+      </w:r>
+      <w:proofErr w:type="spellStart"/>
+      <w:r>
+        <w:t>disponíveis</w:t>
+      </w:r>
+      <w:proofErr w:type="spellEnd"/>
+      <w:r>
+        <w:t xml:space="preserve"> no </w:t>
+      </w:r>
+      <w:proofErr w:type="spellStart"/>
+      <w:r>
+        <w:t>repositório</w:t>
+      </w:r>
+      <w:proofErr w:type="spellEnd"/>
+      <w:r>
+        <w:t xml:space="preserve"> </w:t>
+      </w:r>
+      <w:proofErr w:type="spellStart"/>
+      <w:r>
+        <w:t>oficial</w:t>
+      </w:r>
+      <w:proofErr w:type="spellEnd"/>
+      <w:r>
+        <w:t xml:space="preserve"> do </w:t>
+      </w:r>
+      <w:proofErr w:type="spellStart"/>
+      <w:r>
+        <w:t>projeto</w:t>
+      </w:r>
+      <w:proofErr w:type="spellEnd"/>
+      <w:r>
+        <w:t xml:space="preserve"> no GitHub:</w:t>
+      </w:r>
+    </w:p>
+    <w:p/>
+    <w:p>
+      <w:proofErr w:type="spellStart"/>
+      <w:r>
+        <w:t>Repositório</w:t>
+      </w:r>
+      <w:proofErr w:type="spellEnd"/>
+      <w:r>
+        <w:t xml:space="preserve"> do </w:t>
+      </w:r>
+      <w:proofErr w:type="spellStart"/>
+      <w:r>
+        <w:t>projeto</w:t>
+      </w:r>
+      <w:proofErr w:type="spellEnd"/>
+      <w:r>
+        <w:t>: https://github.com/Kailamota-hub/AgendaSaude_GitHub.git</w:t>
+      </w:r>
+    </w:p>
+    <w:p/>
+    <w:p>
+      <w:r>
+        <w:t xml:space="preserve">O </w:t>
+      </w:r>
+      <w:proofErr w:type="spellStart"/>
+      <w:r>
+        <w:t>repositório</w:t>
+      </w:r>
+      <w:proofErr w:type="spellEnd"/>
+      <w:r>
+        <w:t xml:space="preserve"> </w:t>
+      </w:r>
+      <w:proofErr w:type="spellStart"/>
+      <w:r>
+        <w:t>pode</w:t>
+      </w:r>
+      <w:proofErr w:type="spellEnd"/>
+      <w:r>
+        <w:t xml:space="preserve"> ser </w:t>
+      </w:r>
+      <w:proofErr w:type="spellStart"/>
+      <w:r>
+        <w:t>utilizado</w:t>
+      </w:r>
+      <w:proofErr w:type="spellEnd"/>
+      <w:r>
+        <w:t xml:space="preserve"> para </w:t>
+      </w:r>
+      <w:proofErr w:type="spellStart"/>
+      <w:r>
+        <w:t>análise</w:t>
+      </w:r>
+      <w:proofErr w:type="spellEnd"/>
+      <w:r>
+        <w:t xml:space="preserve"> e </w:t>
+      </w:r>
+      <w:proofErr w:type="spellStart"/>
+      <w:r>
+        <w:t>avaliação</w:t>
+      </w:r>
+      <w:proofErr w:type="spellEnd"/>
+      <w:r>
+        <w:t xml:space="preserve"> do </w:t>
+      </w:r>
+      <w:proofErr w:type="spellStart"/>
+      <w:r>
+        <w:t>projeto</w:t>
+      </w:r>
+      <w:proofErr w:type="spellEnd"/>
+      <w:r>
+        <w:t xml:space="preserve">, </w:t>
+      </w:r>
+      <w:proofErr w:type="spellStart"/>
+      <w:r>
+        <w:t>conforme</w:t>
+      </w:r>
+      <w:proofErr w:type="spellEnd"/>
+      <w:r>
+        <w:t xml:space="preserve"> as </w:t>
+      </w:r>
+      <w:proofErr w:type="spellStart"/>
+      <w:r>
+        <w:t>orientações</w:t>
+      </w:r>
+      <w:proofErr w:type="spellEnd"/>
+      <w:r>
+        <w:t xml:space="preserve"> </w:t>
+      </w:r>
+      <w:proofErr w:type="spellStart"/>
+      <w:r>
+        <w:t>apresentadas</w:t>
+      </w:r>
+      <w:proofErr w:type="spellEnd"/>
+      <w:r>
+        <w:t xml:space="preserve"> no </w:t>
+      </w:r>
+      <w:proofErr w:type="spellStart"/>
+      <w:r>
+        <w:t>arquivo</w:t>
+      </w:r>
+      <w:proofErr w:type="spellEnd"/>
+      <w:r>
+        <w:t xml:space="preserve"> README.md, </w:t>
+      </w:r>
+      <w:proofErr w:type="spellStart"/>
+      <w:r>
+        <w:t>que</w:t>
+      </w:r>
+      <w:proofErr w:type="spellEnd"/>
+      <w:r>
+        <w:t xml:space="preserve"> </w:t>
+      </w:r>
+      <w:proofErr w:type="spellStart"/>
+      <w:r>
+        <w:t>contém</w:t>
+      </w:r>
+      <w:proofErr w:type="spellEnd"/>
+      <w:r>
+        <w:t xml:space="preserve"> as </w:t>
+      </w:r>
+      <w:proofErr w:type="spellStart"/>
+      <w:r>
+        <w:t>instruções</w:t>
+      </w:r>
+      <w:proofErr w:type="spellEnd"/>
+      <w:r>
+        <w:t xml:space="preserve"> </w:t>
+      </w:r>
+      <w:proofErr w:type="spellStart"/>
+      <w:r>
+        <w:t>necessárias</w:t>
+      </w:r>
+      <w:proofErr w:type="spellEnd"/>
+      <w:r>
+        <w:t xml:space="preserve"> para </w:t>
+      </w:r>
+      <w:proofErr w:type="spellStart"/>
+      <w:r>
+        <w:t>configuração</w:t>
+      </w:r>
+      <w:proofErr w:type="spellEnd"/>
+      <w:r>
+        <w:t xml:space="preserve">, </w:t>
+      </w:r>
+      <w:proofErr w:type="spellStart"/>
+      <w:r>
+        <w:t>execução</w:t>
+      </w:r>
+      <w:proofErr w:type="spellEnd"/>
+      <w:r>
+        <w:t xml:space="preserve"> e </w:t>
+      </w:r>
+      <w:proofErr w:type="spellStart"/>
+      <w:r>
+        <w:t>utilização</w:t>
+      </w:r>
+      <w:proofErr w:type="spellEnd"/>
+      <w:r>
+        <w:t xml:space="preserve"> do </w:t>
+      </w:r>
+      <w:proofErr w:type="spellStart"/>
+      <w:r>
+        <w:t>sistema</w:t>
+      </w:r>
+      <w:proofErr w:type="spellEnd"/>
+      <w:r>
+        <w:t>.</w:t>
+      </w:r>
+    </w:p>
+    <w:p/>
+    <w:p>
+      <w:r>
+        <w:t xml:space="preserve">O </w:t>
+      </w:r>
+      <w:proofErr w:type="spellStart"/>
+      <w:r>
+        <w:t>repositório</w:t>
+      </w:r>
+      <w:proofErr w:type="spellEnd"/>
+      <w:r>
+        <w:t xml:space="preserve"> </w:t>
+      </w:r>
+      <w:proofErr w:type="spellStart"/>
+      <w:r>
+        <w:t>foi</w:t>
+      </w:r>
+      <w:proofErr w:type="spellEnd"/>
+      <w:r>
+        <w:t xml:space="preserve"> </w:t>
+      </w:r>
+      <w:proofErr w:type="spellStart"/>
+      <w:r>
+        <w:t>estruturado</w:t>
+      </w:r>
+      <w:proofErr w:type="spellEnd"/>
+      <w:r>
+        <w:t xml:space="preserve"> para </w:t>
+      </w:r>
+      <w:proofErr w:type="spellStart"/>
+      <w:r>
+        <w:t>concentrar</w:t>
+      </w:r>
+      <w:proofErr w:type="spellEnd"/>
+      <w:r>
+        <w:t xml:space="preserve"> </w:t>
+      </w:r>
+      <w:proofErr w:type="spellStart"/>
+      <w:r>
+        <w:t>todos</w:t>
+      </w:r>
+      <w:proofErr w:type="spellEnd"/>
+      <w:r>
+        <w:t xml:space="preserve"> </w:t>
+      </w:r>
+      <w:proofErr w:type="spellStart"/>
+      <w:r>
+        <w:t>os</w:t>
+      </w:r>
+      <w:proofErr w:type="spellEnd"/>
+      <w:r>
+        <w:t xml:space="preserve"> </w:t>
+      </w:r>
+      <w:proofErr w:type="spellStart"/>
+      <w:r>
+        <w:t>materiais</w:t>
+      </w:r>
+      <w:proofErr w:type="spellEnd"/>
+      <w:r>
+        <w:t xml:space="preserve"> </w:t>
+      </w:r>
+      <w:proofErr w:type="spellStart"/>
+      <w:r>
+        <w:t>solicitados</w:t>
+      </w:r>
+      <w:proofErr w:type="spellEnd"/>
+      <w:r>
+        <w:t xml:space="preserve"> </w:t>
+      </w:r>
+      <w:proofErr w:type="spellStart"/>
+      <w:r>
+        <w:t>na</w:t>
+      </w:r>
+      <w:proofErr w:type="spellEnd"/>
+      <w:r>
+        <w:t xml:space="preserve"> </w:t>
+      </w:r>
+      <w:proofErr w:type="spellStart"/>
+      <w:r>
+        <w:t>atividade</w:t>
+      </w:r>
+      <w:proofErr w:type="spellEnd"/>
+      <w:r>
+        <w:t xml:space="preserve"> e </w:t>
+      </w:r>
+      <w:proofErr w:type="spellStart"/>
+      <w:r>
+        <w:t>permitir</w:t>
+      </w:r>
+      <w:proofErr w:type="spellEnd"/>
+      <w:r>
+        <w:t xml:space="preserve"> </w:t>
+      </w:r>
+      <w:proofErr w:type="spellStart"/>
+      <w:r>
+        <w:t>que</w:t>
+      </w:r>
+      <w:proofErr w:type="spellEnd"/>
+      <w:r>
+        <w:t xml:space="preserve"> </w:t>
+      </w:r>
+      <w:proofErr w:type="spellStart"/>
+      <w:r>
+        <w:t>o</w:t>
+      </w:r>
+      <w:proofErr w:type="spellEnd"/>
+      <w:r>
+        <w:t xml:space="preserve"> </w:t>
+      </w:r>
+      <w:proofErr w:type="spellStart"/>
+      <w:r>
+        <w:t>avaliador</w:t>
+      </w:r>
+      <w:proofErr w:type="spellEnd"/>
+      <w:r>
+        <w:t xml:space="preserve"> </w:t>
+      </w:r>
+      <w:proofErr w:type="spellStart"/>
+      <w:r>
+        <w:t>identifique</w:t>
+      </w:r>
+      <w:proofErr w:type="spellEnd"/>
+      <w:r>
+        <w:t xml:space="preserve"> </w:t>
+      </w:r>
+      <w:proofErr w:type="spellStart"/>
+      <w:r>
+        <w:t>rapidamente</w:t>
+      </w:r>
+      <w:proofErr w:type="spellEnd"/>
+      <w:r>
+        <w:t xml:space="preserve"> </w:t>
+      </w:r>
+      <w:proofErr w:type="spellStart"/>
+      <w:r>
+        <w:t>os</w:t>
+      </w:r>
+      <w:proofErr w:type="spellEnd"/>
+      <w:r>
+        <w:t xml:space="preserve"> </w:t>
+      </w:r>
+      <w:proofErr w:type="spellStart"/>
+      <w:r>
+        <w:t>componentes</w:t>
+      </w:r>
+      <w:proofErr w:type="spellEnd"/>
+      <w:r>
+        <w:t xml:space="preserve"> da </w:t>
+      </w:r>
+      <w:proofErr w:type="spellStart"/>
+      <w:r>
+        <w:t>solução</w:t>
+      </w:r>
+      <w:proofErr w:type="spellEnd"/>
+      <w:r>
+        <w:t>.</w:t>
+      </w:r>
+    </w:p>
+    <w:p/>
+    <w:p/>
     <w:p>
       <w:pPr>
         <w:pStyle w:val="Ttulo1"/>
@@ -1971,9 +3545,9 @@
       </w:r>
     </w:p>
     <w:p>
-      <w:r>
-        <w:t>O vídeo final poderá ser incluído no diretório video em formato MP4 ou disponibilizado por link privado/não listado do YouTube. O campo destinado ao link deve ser atualizado antes da entrega definitiva do repositório.</w:t>
-      </w:r>
+      <w:pPr>
+        <w:ind w:firstLine="0"/>
+      </w:pPr>
     </w:p>
     <w:p>
       <w:pPr>
@@ -2319,9 +3893,19 @@
               <w:ind w:firstLine="0"/>
               <w:jc w:val="left"/>
             </w:pPr>
+            <w:proofErr w:type="spellStart"/>
             <w:r>
-              <w:t>Gravação pendente pelo grupo</w:t>
+              <w:t>Gravação</w:t>
             </w:r>
+            <w:proofErr w:type="spellEnd"/>
+            <w:r>
+              <w:t xml:space="preserve"> </w:t>
+            </w:r>
+            <w:proofErr w:type="spellStart"/>
+            <w:r>
+              <w:t>realizada</w:t>
+            </w:r>
+            <w:proofErr w:type="spellEnd"/>
           </w:p>
         </w:tc>
       </w:tr>
@@ -2372,9 +3956,11 @@
               <w:ind w:firstLine="0"/>
               <w:jc w:val="left"/>
             </w:pPr>
+            <w:proofErr w:type="spellStart"/>
             <w:r>
-              <w:t>Pronto para publicação</w:t>
+              <w:t>Publicado</w:t>
             </w:r>
+            <w:proofErr w:type="spellEnd"/>
           </w:p>
         </w:tc>
       </w:tr>
@@ -2384,13 +3970,61 @@
         <w:spacing w:line="240" w:lineRule="auto"/>
         <w:ind w:firstLine="0"/>
         <w:jc w:val="center"/>
-      </w:pPr>
-      <w:r>
         <w:rPr>
           <w:i/>
         </w:rPr>
-        <w:t>Fonte: Elaboração autoral.</w:t>
-      </w:r>
+      </w:pPr>
+      <w:r>
+        <w:rPr>
+          <w:i/>
+        </w:rPr>
+        <w:t xml:space="preserve">Fonte: </w:t>
+      </w:r>
+      <w:proofErr w:type="spellStart"/>
+      <w:r>
+        <w:rPr>
+          <w:i/>
+        </w:rPr>
+        <w:t>Elaboração</w:t>
+      </w:r>
+      <w:proofErr w:type="spellEnd"/>
+      <w:r>
+        <w:rPr>
+          <w:i/>
+        </w:rPr>
+        <w:t xml:space="preserve"> </w:t>
+      </w:r>
+      <w:proofErr w:type="spellStart"/>
+      <w:r>
+        <w:rPr>
+          <w:i/>
+        </w:rPr>
+        <w:t>autoral</w:t>
+      </w:r>
+      <w:proofErr w:type="spellEnd"/>
+      <w:r>
+        <w:rPr>
+          <w:i/>
+        </w:rPr>
+        <w:t>.</w:t>
+      </w:r>
+    </w:p>
+    <w:p>
+      <w:pPr>
+        <w:spacing w:line="240" w:lineRule="auto"/>
+        <w:ind w:firstLine="0"/>
+        <w:jc w:val="center"/>
+        <w:rPr>
+          <w:i/>
+        </w:rPr>
+      </w:pPr>
+    </w:p>
+    <w:p>
+      <w:pPr>
+        <w:spacing w:line="240" w:lineRule="auto"/>
+        <w:ind w:firstLine="0"/>
+        <w:jc w:val="center"/>
+      </w:pPr>
     </w:p>
     <w:p>
       <w:pPr>
@@ -2405,11 +4039,11 @@
     </w:p>
     <w:p>
       <w:r>
-        <w:t xml:space="preserve">A segunda etapa permitiu transformar a proposta conceitual do AgendaSaúde em uma prova de conceito funcional, mantendo relação direta com a persona e a jornada </w:t>
+        <w:t xml:space="preserve">A segunda etapa permitiu transformar a proposta conceitual do AgendaSaúde em uma prova de conceito funcional, mantendo relação direta com a persona e a jornada construídas anteriormente. A solução demonstra que o fluxo de agendamento pode ser </w:t>
       </w:r>
       <w:r>
         <w:lastRenderedPageBreak/>
-        <w:t>construídas anteriormente. A solução demonstra que o fluxo de agendamento pode ser digitalizado de maneira simples, com controle de disponibilidade, persistência de dados e mecanismos de acompanhamento pelo próprio paciente.</w:t>
+        <w:t>digitalizado de maneira simples, com controle de disponibilidade, persistência de dados e mecanismos de acompanhamento pelo próprio paciente.</w:t>
       </w:r>
     </w:p>
     <w:p>
@@ -2427,7 +4061,55 @@
       </w:r>
       <w:proofErr w:type="gramEnd"/>
       <w:r>
-        <w:t xml:space="preserve"> organização dos atendimentos e oferecer maior autonomia ao paciente, mantendo os objetivos </w:t>
+        <w:t xml:space="preserve"> organização dos atendimentos e oferecer maior </w:t>
+      </w:r>
+      <w:proofErr w:type="spellStart"/>
+      <w:r>
+        <w:t>autonomia</w:t>
+      </w:r>
+      <w:proofErr w:type="spellEnd"/>
+      <w:r>
+        <w:t xml:space="preserve"> </w:t>
+      </w:r>
+      <w:proofErr w:type="spellStart"/>
+      <w:r>
+        <w:t>ao</w:t>
+      </w:r>
+      <w:proofErr w:type="spellEnd"/>
+      <w:r>
+        <w:t xml:space="preserve"> </w:t>
+      </w:r>
+      <w:proofErr w:type="spellStart"/>
+      <w:r>
+        <w:t>paciente</w:t>
+      </w:r>
+      <w:proofErr w:type="spellEnd"/>
+      <w:r>
+        <w:t xml:space="preserve">, </w:t>
+      </w:r>
+      <w:proofErr w:type="spellStart"/>
+      <w:r>
+        <w:t>mantendo</w:t>
+      </w:r>
+      <w:proofErr w:type="spellEnd"/>
+      <w:r>
+        <w:t xml:space="preserve"> </w:t>
+      </w:r>
+      <w:proofErr w:type="spellStart"/>
+      <w:r>
+        <w:t>os</w:t>
+      </w:r>
+      <w:proofErr w:type="spellEnd"/>
+      <w:r>
+        <w:t xml:space="preserve"> </w:t>
+      </w:r>
+      <w:proofErr w:type="spellStart"/>
+      <w:r>
+        <w:t>objetivos</w:t>
+      </w:r>
+      <w:proofErr w:type="spellEnd"/>
+      <w:r>
+        <w:t xml:space="preserve"> </w:t>
       </w:r>
       <w:proofErr w:type="spellStart"/>
       <w:r>
@@ -2464,20 +4146,6 @@
     </w:p>
     <w:p/>
     <w:p/>
-    <w:p/>
-    <w:p/>
-    <w:p/>
-    <w:p/>
-    <w:p/>
-    <w:p/>
-    <w:p/>
-    <w:p/>
-    <w:p/>
-    <w:p/>
-    <w:p/>
-    <w:p/>
-    <w:p/>
-    <w:p/>
     <w:p>
       <w:pPr>
         <w:pStyle w:val="Ttulo1"/>
@@ -2486,7 +4154,6 @@
         <w:rPr>
           <w:rFonts w:ascii="Times New Roman" w:eastAsia="Times New Roman" w:hAnsi="Times New Roman"/>
         </w:rPr>
-        <w:lastRenderedPageBreak/>
         <w:t>REFERÊNCIAS</w:t>
       </w:r>
     </w:p>
@@ -14236,6 +15903,29 @@
       </w:tcPr>
     </w:tblStylePr>
   </w:style>
+  <w:style w:type="character" w:styleId="Hyperlink">
+    <w:name w:val="Hyperlink"/>
+    <w:basedOn w:val="Fontepargpadro"/>
+    <w:uiPriority w:val="99"/>
+    <w:unhideWhenUsed/>
+    <w:rsid w:val="008D1664"/>
+    <w:rPr>
+      <w:color w:val="0000FF" w:themeColor="hyperlink"/>
+      <w:u w:val="single"/>
+    </w:rPr>
+  </w:style>
+  <w:style w:type="character" w:styleId="MenoPendente">
+    <w:name w:val="Unresolved Mention"/>
+    <w:basedOn w:val="Fontepargpadro"/>
+    <w:uiPriority w:val="99"/>
+    <w:semiHidden/>
+    <w:unhideWhenUsed/>
+    <w:rsid w:val="008D1664"/>
+    <w:rPr>
+      <w:color w:val="605E5C"/>
+      <w:shd w:val="clear" w:color="auto" w:fill="E1DFDD"/>
+    </w:rPr>
+  </w:style>
 </w:styles>
 </file>
 

</xml_diff>